<commit_message>
Update report to include a note on Longformer
</commit_message>
<xml_diff>
--- a/report/genai_p3_report_summary.docx
+++ b/report/genai_p3_report_summary.docx
@@ -784,7 +784,7 @@
           <w:r>
             <w:fldChar w:fldCharType="separate"/>
           </w:r>
-          <w:hyperlink w:anchor="_Toc214276332" w:history="1">
+          <w:hyperlink w:anchor="_Toc214300268" w:history="1">
             <w:r>
               <w:rPr>
                 <w:rStyle w:val="Hyperlink"/>
@@ -811,7 +811,76 @@
                 <w:noProof/>
                 <w:webHidden/>
               </w:rPr>
-              <w:instrText xml:space="preserve"> PAGEREF _Toc214276332 \h </w:instrText>
+              <w:instrText xml:space="preserve"> PAGEREF _Toc214300268 \h </w:instrText>
+            </w:r>
+            <w:r>
+              <w:rPr>
+                <w:noProof/>
+                <w:webHidden/>
+              </w:rPr>
+            </w:r>
+            <w:r>
+              <w:rPr>
+                <w:noProof/>
+                <w:webHidden/>
+              </w:rPr>
+              <w:fldChar w:fldCharType="separate"/>
+            </w:r>
+            <w:r>
+              <w:rPr>
+                <w:noProof/>
+                <w:webHidden/>
+              </w:rPr>
+              <w:t>2</w:t>
+            </w:r>
+            <w:r>
+              <w:rPr>
+                <w:noProof/>
+                <w:webHidden/>
+              </w:rPr>
+              <w:fldChar w:fldCharType="end"/>
+            </w:r>
+          </w:hyperlink>
+        </w:p>
+        <w:p>
+          <w:pPr>
+            <w:pStyle w:val="TOC3"/>
+            <w:tabs>
+              <w:tab w:val="right" w:leader="dot" w:pos="9304"/>
+            </w:tabs>
+            <w:rPr>
+              <w:rFonts w:eastAsiaTheme="minorEastAsia"/>
+              <w:noProof/>
+            </w:rPr>
+          </w:pPr>
+          <w:hyperlink w:anchor="_Toc214300269" w:history="1">
+            <w:r>
+              <w:rPr>
+                <w:rStyle w:val="Hyperlink"/>
+                <w:noProof/>
+              </w:rPr>
+              <w:t>Notes on computational constraints and limitations of the experimental setup</w:t>
+            </w:r>
+            <w:r>
+              <w:rPr>
+                <w:noProof/>
+                <w:webHidden/>
+              </w:rPr>
+              <w:tab/>
+            </w:r>
+            <w:r>
+              <w:rPr>
+                <w:noProof/>
+                <w:webHidden/>
+              </w:rPr>
+              <w:fldChar w:fldCharType="begin"/>
+            </w:r>
+            <w:r>
+              <w:rPr>
+                <w:noProof/>
+                <w:webHidden/>
+              </w:rPr>
+              <w:instrText xml:space="preserve"> PAGEREF _Toc214300269 \h </w:instrText>
             </w:r>
             <w:r>
               <w:rPr>
@@ -853,7 +922,7 @@
               <w:noProof/>
             </w:rPr>
           </w:pPr>
-          <w:hyperlink w:anchor="_Toc214276333" w:history="1">
+          <w:hyperlink w:anchor="_Toc214300270" w:history="1">
             <w:r>
               <w:rPr>
                 <w:rStyle w:val="Hyperlink"/>
@@ -880,7 +949,7 @@
                 <w:noProof/>
                 <w:webHidden/>
               </w:rPr>
-              <w:instrText xml:space="preserve"> PAGEREF _Toc214276333 \h </w:instrText>
+              <w:instrText xml:space="preserve"> PAGEREF _Toc214300270 \h </w:instrText>
             </w:r>
             <w:r>
               <w:rPr>
@@ -922,7 +991,7 @@
               <w:noProof/>
             </w:rPr>
           </w:pPr>
-          <w:hyperlink w:anchor="_Toc214276334" w:history="1">
+          <w:hyperlink w:anchor="_Toc214300271" w:history="1">
             <w:r>
               <w:rPr>
                 <w:rStyle w:val="Hyperlink"/>
@@ -949,7 +1018,7 @@
                 <w:noProof/>
                 <w:webHidden/>
               </w:rPr>
-              <w:instrText xml:space="preserve"> PAGEREF _Toc214276334 \h </w:instrText>
+              <w:instrText xml:space="preserve"> PAGEREF _Toc214300271 \h </w:instrText>
             </w:r>
             <w:r>
               <w:rPr>
@@ -991,7 +1060,7 @@
               <w:noProof/>
             </w:rPr>
           </w:pPr>
-          <w:hyperlink w:anchor="_Toc214276335" w:history="1">
+          <w:hyperlink w:anchor="_Toc214300272" w:history="1">
             <w:r>
               <w:rPr>
                 <w:rStyle w:val="Hyperlink"/>
@@ -1018,7 +1087,7 @@
                 <w:noProof/>
                 <w:webHidden/>
               </w:rPr>
-              <w:instrText xml:space="preserve"> PAGEREF _Toc214276335 \h </w:instrText>
+              <w:instrText xml:space="preserve"> PAGEREF _Toc214300272 \h </w:instrText>
             </w:r>
             <w:r>
               <w:rPr>
@@ -1060,7 +1129,7 @@
               <w:noProof/>
             </w:rPr>
           </w:pPr>
-          <w:hyperlink w:anchor="_Toc214276336" w:history="1">
+          <w:hyperlink w:anchor="_Toc214300273" w:history="1">
             <w:r>
               <w:rPr>
                 <w:rStyle w:val="Hyperlink"/>
@@ -1087,7 +1156,7 @@
                 <w:noProof/>
                 <w:webHidden/>
               </w:rPr>
-              <w:instrText xml:space="preserve"> PAGEREF _Toc214276336 \h </w:instrText>
+              <w:instrText xml:space="preserve"> PAGEREF _Toc214300273 \h </w:instrText>
             </w:r>
             <w:r>
               <w:rPr>
@@ -1129,7 +1198,7 @@
               <w:noProof/>
             </w:rPr>
           </w:pPr>
-          <w:hyperlink w:anchor="_Toc214276337" w:history="1">
+          <w:hyperlink w:anchor="_Toc214300274" w:history="1">
             <w:r>
               <w:rPr>
                 <w:rStyle w:val="Hyperlink"/>
@@ -1156,7 +1225,7 @@
                 <w:noProof/>
                 <w:webHidden/>
               </w:rPr>
-              <w:instrText xml:space="preserve"> PAGEREF _Toc214276337 \h </w:instrText>
+              <w:instrText xml:space="preserve"> PAGEREF _Toc214300274 \h </w:instrText>
             </w:r>
             <w:r>
               <w:rPr>
@@ -1198,7 +1267,7 @@
               <w:noProof/>
             </w:rPr>
           </w:pPr>
-          <w:hyperlink w:anchor="_Toc214276338" w:history="1">
+          <w:hyperlink w:anchor="_Toc214300275" w:history="1">
             <w:r>
               <w:rPr>
                 <w:rStyle w:val="Hyperlink"/>
@@ -1225,7 +1294,7 @@
                 <w:noProof/>
                 <w:webHidden/>
               </w:rPr>
-              <w:instrText xml:space="preserve"> PAGEREF _Toc214276338 \h </w:instrText>
+              <w:instrText xml:space="preserve"> PAGEREF _Toc214300275 \h </w:instrText>
             </w:r>
             <w:r>
               <w:rPr>
@@ -1267,7 +1336,7 @@
               <w:noProof/>
             </w:rPr>
           </w:pPr>
-          <w:hyperlink w:anchor="_Toc214276339" w:history="1">
+          <w:hyperlink w:anchor="_Toc214300276" w:history="1">
             <w:r>
               <w:rPr>
                 <w:rStyle w:val="Hyperlink"/>
@@ -1294,7 +1363,7 @@
                 <w:noProof/>
                 <w:webHidden/>
               </w:rPr>
-              <w:instrText xml:space="preserve"> PAGEREF _Toc214276339 \h </w:instrText>
+              <w:instrText xml:space="preserve"> PAGEREF _Toc214300276 \h </w:instrText>
             </w:r>
             <w:r>
               <w:rPr>
@@ -1336,7 +1405,7 @@
               <w:noProof/>
             </w:rPr>
           </w:pPr>
-          <w:hyperlink w:anchor="_Toc214276340" w:history="1">
+          <w:hyperlink w:anchor="_Toc214300277" w:history="1">
             <w:r>
               <w:rPr>
                 <w:rStyle w:val="Hyperlink"/>
@@ -1363,76 +1432,7 @@
                 <w:noProof/>
                 <w:webHidden/>
               </w:rPr>
-              <w:instrText xml:space="preserve"> PAGEREF _Toc214276340 \h </w:instrText>
-            </w:r>
-            <w:r>
-              <w:rPr>
-                <w:noProof/>
-                <w:webHidden/>
-              </w:rPr>
-            </w:r>
-            <w:r>
-              <w:rPr>
-                <w:noProof/>
-                <w:webHidden/>
-              </w:rPr>
-              <w:fldChar w:fldCharType="separate"/>
-            </w:r>
-            <w:r>
-              <w:rPr>
-                <w:noProof/>
-                <w:webHidden/>
-              </w:rPr>
-              <w:t>6</w:t>
-            </w:r>
-            <w:r>
-              <w:rPr>
-                <w:noProof/>
-                <w:webHidden/>
-              </w:rPr>
-              <w:fldChar w:fldCharType="end"/>
-            </w:r>
-          </w:hyperlink>
-        </w:p>
-        <w:p>
-          <w:pPr>
-            <w:pStyle w:val="TOC2"/>
-            <w:tabs>
-              <w:tab w:val="right" w:leader="dot" w:pos="9304"/>
-            </w:tabs>
-            <w:rPr>
-              <w:rFonts w:eastAsiaTheme="minorEastAsia"/>
-              <w:noProof/>
-            </w:rPr>
-          </w:pPr>
-          <w:hyperlink w:anchor="_Toc214276341" w:history="1">
-            <w:r>
-              <w:rPr>
-                <w:rStyle w:val="Hyperlink"/>
-                <w:noProof/>
-              </w:rPr>
-              <w:t>6. Limitations</w:t>
-            </w:r>
-            <w:r>
-              <w:rPr>
-                <w:noProof/>
-                <w:webHidden/>
-              </w:rPr>
-              <w:tab/>
-            </w:r>
-            <w:r>
-              <w:rPr>
-                <w:noProof/>
-                <w:webHidden/>
-              </w:rPr>
-              <w:fldChar w:fldCharType="begin"/>
-            </w:r>
-            <w:r>
-              <w:rPr>
-                <w:noProof/>
-                <w:webHidden/>
-              </w:rPr>
-              <w:instrText xml:space="preserve"> PAGEREF _Toc214276341 \h </w:instrText>
+              <w:instrText xml:space="preserve"> PAGEREF _Toc214300277 \h </w:instrText>
             </w:r>
             <w:r>
               <w:rPr>
@@ -1474,7 +1474,76 @@
               <w:noProof/>
             </w:rPr>
           </w:pPr>
-          <w:hyperlink w:anchor="_Toc214276342" w:history="1">
+          <w:hyperlink w:anchor="_Toc214300278" w:history="1">
+            <w:r>
+              <w:rPr>
+                <w:rStyle w:val="Hyperlink"/>
+                <w:noProof/>
+              </w:rPr>
+              <w:t>6. Limitations</w:t>
+            </w:r>
+            <w:r>
+              <w:rPr>
+                <w:noProof/>
+                <w:webHidden/>
+              </w:rPr>
+              <w:tab/>
+            </w:r>
+            <w:r>
+              <w:rPr>
+                <w:noProof/>
+                <w:webHidden/>
+              </w:rPr>
+              <w:fldChar w:fldCharType="begin"/>
+            </w:r>
+            <w:r>
+              <w:rPr>
+                <w:noProof/>
+                <w:webHidden/>
+              </w:rPr>
+              <w:instrText xml:space="preserve"> PAGEREF _Toc214300278 \h </w:instrText>
+            </w:r>
+            <w:r>
+              <w:rPr>
+                <w:noProof/>
+                <w:webHidden/>
+              </w:rPr>
+            </w:r>
+            <w:r>
+              <w:rPr>
+                <w:noProof/>
+                <w:webHidden/>
+              </w:rPr>
+              <w:fldChar w:fldCharType="separate"/>
+            </w:r>
+            <w:r>
+              <w:rPr>
+                <w:noProof/>
+                <w:webHidden/>
+              </w:rPr>
+              <w:t>7</w:t>
+            </w:r>
+            <w:r>
+              <w:rPr>
+                <w:noProof/>
+                <w:webHidden/>
+              </w:rPr>
+              <w:fldChar w:fldCharType="end"/>
+            </w:r>
+          </w:hyperlink>
+        </w:p>
+        <w:p>
+          <w:pPr>
+            <w:pStyle w:val="TOC2"/>
+            <w:tabs>
+              <w:tab w:val="right" w:leader="dot" w:pos="9304"/>
+            </w:tabs>
+            <w:rPr>
+              <w:rFonts w:eastAsiaTheme="minorEastAsia"/>
+              <w:noProof/>
+            </w:rPr>
+          </w:pPr>
+          <w:hyperlink w:anchor="_Toc214300279" w:history="1">
             <w:r>
               <w:rPr>
                 <w:rStyle w:val="Hyperlink"/>
@@ -1501,7 +1570,7 @@
                 <w:noProof/>
                 <w:webHidden/>
               </w:rPr>
-              <w:instrText xml:space="preserve"> PAGEREF _Toc214276342 \h </w:instrText>
+              <w:instrText xml:space="preserve"> PAGEREF _Toc214300279 \h </w:instrText>
             </w:r>
             <w:r>
               <w:rPr>
@@ -1564,11 +1633,12 @@
           <w:rFonts w:asciiTheme="minorHAnsi" w:hAnsiTheme="minorHAnsi"/>
         </w:rPr>
       </w:pPr>
-      <w:bookmarkStart w:id="1" w:name="_Toc214276332"/>
+      <w:bookmarkStart w:id="1" w:name="_Toc214300268"/>
       <w:r>
         <w:rPr>
           <w:rFonts w:asciiTheme="minorHAnsi" w:hAnsiTheme="minorHAnsi"/>
         </w:rPr>
+        <w:lastRenderedPageBreak/>
         <w:t>1. Problem Statement and Objectives</w:t>
       </w:r>
       <w:bookmarkEnd w:id="1"/>
@@ -1666,19 +1736,495 @@
     </w:p>
     <w:p>
       <w:pPr>
+        <w:pStyle w:val="Heading3"/>
+        <w:rPr>
+          <w:sz w:val="26"/>
+          <w:szCs w:val="26"/>
+        </w:rPr>
+      </w:pPr>
+      <w:bookmarkStart w:id="2" w:name="_Toc214300269"/>
+      <w:r>
+        <w:rPr>
+          <w:sz w:val="26"/>
+          <w:szCs w:val="26"/>
+        </w:rPr>
+        <w:t>Note</w:t>
+      </w:r>
+      <w:r>
+        <w:rPr>
+          <w:sz w:val="26"/>
+          <w:szCs w:val="26"/>
+        </w:rPr>
+        <w:t>s</w:t>
+      </w:r>
+      <w:r>
+        <w:rPr>
+          <w:sz w:val="26"/>
+          <w:szCs w:val="26"/>
+        </w:rPr>
+        <w:t xml:space="preserve"> on </w:t>
+      </w:r>
+      <w:r>
+        <w:rPr>
+          <w:sz w:val="26"/>
+          <w:szCs w:val="26"/>
+        </w:rPr>
+        <w:t>c</w:t>
+      </w:r>
+      <w:r>
+        <w:rPr>
+          <w:sz w:val="26"/>
+          <w:szCs w:val="26"/>
+        </w:rPr>
+        <w:t>omputational constraints and limitations of the experimental setup</w:t>
+      </w:r>
+      <w:bookmarkEnd w:id="2"/>
+    </w:p>
+    <w:p>
+      <w:pPr>
+        <w:spacing w:after="80"/>
+        <w:jc w:val="both"/>
+        <w:rPr>
+          <w:sz w:val="20"/>
+          <w:szCs w:val="20"/>
+        </w:rPr>
+      </w:pPr>
+      <w:r>
+        <w:rPr>
+          <w:sz w:val="20"/>
+          <w:szCs w:val="20"/>
+        </w:rPr>
+        <w:t>Although we had access to</w:t>
+      </w:r>
+      <w:r>
+        <w:rPr>
+          <w:sz w:val="20"/>
+          <w:szCs w:val="20"/>
+        </w:rPr>
+        <w:t xml:space="preserve"> </w:t>
+      </w:r>
+      <w:r>
+        <w:rPr>
+          <w:sz w:val="20"/>
+          <w:szCs w:val="20"/>
+        </w:rPr>
+        <w:t xml:space="preserve">some high-end </w:t>
+      </w:r>
+      <w:r>
+        <w:rPr>
+          <w:sz w:val="20"/>
+          <w:szCs w:val="20"/>
+        </w:rPr>
+        <w:t>consumer GPU</w:t>
+      </w:r>
+      <w:r>
+        <w:rPr>
+          <w:sz w:val="20"/>
+          <w:szCs w:val="20"/>
+        </w:rPr>
+        <w:t>s</w:t>
+      </w:r>
+      <w:r>
+        <w:rPr>
+          <w:sz w:val="20"/>
+          <w:szCs w:val="20"/>
+        </w:rPr>
+        <w:t xml:space="preserve"> and even </w:t>
+      </w:r>
+      <w:r>
+        <w:rPr>
+          <w:sz w:val="20"/>
+          <w:szCs w:val="20"/>
+        </w:rPr>
+        <w:t xml:space="preserve">a data </w:t>
+      </w:r>
+      <w:r>
+        <w:rPr>
+          <w:sz w:val="20"/>
+          <w:szCs w:val="20"/>
+        </w:rPr>
+        <w:t>center</w:t>
+      </w:r>
+      <w:r>
+        <w:rPr>
+          <w:sz w:val="20"/>
+          <w:szCs w:val="20"/>
+        </w:rPr>
+        <w:t xml:space="preserve"> GPU with 96 GB of VRAM, the combination of a relatively large dataset and a long-context transformer model (</w:t>
+      </w:r>
+      <w:proofErr w:type="spellStart"/>
+      <w:r>
+        <w:rPr>
+          <w:sz w:val="20"/>
+          <w:szCs w:val="20"/>
+        </w:rPr>
+        <w:fldChar w:fldCharType="begin"/>
+      </w:r>
+      <w:r>
+        <w:rPr>
+          <w:sz w:val="20"/>
+          <w:szCs w:val="20"/>
+        </w:rPr>
+        <w:instrText>HYPERLINK "https://arxiv.org/pdf/2004.05150"</w:instrText>
+      </w:r>
+      <w:r>
+        <w:rPr>
+          <w:sz w:val="20"/>
+          <w:szCs w:val="20"/>
+        </w:rPr>
+      </w:r>
+      <w:r>
+        <w:rPr>
+          <w:sz w:val="20"/>
+          <w:szCs w:val="20"/>
+        </w:rPr>
+        <w:fldChar w:fldCharType="separate"/>
+      </w:r>
+      <w:r>
+        <w:rPr>
+          <w:rStyle w:val="Hyperlink"/>
+          <w:sz w:val="20"/>
+          <w:szCs w:val="20"/>
+        </w:rPr>
+        <w:t>Longformer</w:t>
+      </w:r>
+      <w:proofErr w:type="spellEnd"/>
+      <w:r>
+        <w:rPr>
+          <w:sz w:val="20"/>
+          <w:szCs w:val="20"/>
+        </w:rPr>
+        <w:fldChar w:fldCharType="end"/>
+      </w:r>
+      <w:r>
+        <w:rPr>
+          <w:sz w:val="20"/>
+          <w:szCs w:val="20"/>
+        </w:rPr>
+        <w:t xml:space="preserve">, supporting </w:t>
+      </w:r>
+      <w:r>
+        <w:rPr>
+          <w:sz w:val="20"/>
+          <w:szCs w:val="20"/>
+        </w:rPr>
+        <w:t xml:space="preserve">a </w:t>
+      </w:r>
+      <w:proofErr w:type="spellStart"/>
+      <w:r>
+        <w:rPr>
+          <w:sz w:val="20"/>
+          <w:szCs w:val="20"/>
+        </w:rPr>
+        <w:t>max_length</w:t>
+      </w:r>
+      <w:proofErr w:type="spellEnd"/>
+      <w:r>
+        <w:rPr>
+          <w:sz w:val="20"/>
+          <w:szCs w:val="20"/>
+        </w:rPr>
+        <w:t xml:space="preserve"> of </w:t>
+      </w:r>
+      <w:r>
+        <w:rPr>
+          <w:sz w:val="20"/>
+          <w:szCs w:val="20"/>
+        </w:rPr>
+        <w:t>4096</w:t>
+      </w:r>
+      <w:r>
+        <w:rPr>
+          <w:sz w:val="20"/>
+          <w:szCs w:val="20"/>
+        </w:rPr>
+        <w:t xml:space="preserve"> </w:t>
+      </w:r>
+      <w:r>
+        <w:rPr>
+          <w:sz w:val="20"/>
+          <w:szCs w:val="20"/>
+        </w:rPr>
+        <w:t>token sequences) imposed substantial computational and runtime costs.</w:t>
+      </w:r>
+    </w:p>
+    <w:p>
+      <w:pPr>
+        <w:spacing w:after="80"/>
+        <w:jc w:val="both"/>
+        <w:rPr>
+          <w:sz w:val="20"/>
+          <w:szCs w:val="20"/>
+        </w:rPr>
+      </w:pPr>
+      <w:r>
+        <w:rPr>
+          <w:sz w:val="20"/>
+          <w:szCs w:val="20"/>
+        </w:rPr>
+        <w:t xml:space="preserve">In practice, </w:t>
+      </w:r>
+      <w:r>
+        <w:rPr>
+          <w:sz w:val="20"/>
+          <w:szCs w:val="20"/>
+        </w:rPr>
+        <w:t>most of our</w:t>
+      </w:r>
+      <w:r>
+        <w:rPr>
+          <w:sz w:val="20"/>
+          <w:szCs w:val="20"/>
+        </w:rPr>
+        <w:t xml:space="preserve"> training attempts were interrupted by </w:t>
+      </w:r>
+      <w:r>
+        <w:rPr>
+          <w:sz w:val="20"/>
+          <w:szCs w:val="20"/>
+        </w:rPr>
+        <w:t xml:space="preserve">CUDA </w:t>
+      </w:r>
+      <w:r>
+        <w:rPr>
+          <w:sz w:val="20"/>
+          <w:szCs w:val="20"/>
+        </w:rPr>
+        <w:t xml:space="preserve">out-of-memory errors, indicating that the effective capacity of the hardware was exceeded under certain configurations </w:t>
+      </w:r>
+      <w:r>
+        <w:rPr>
+          <w:sz w:val="20"/>
+          <w:szCs w:val="20"/>
+        </w:rPr>
+        <w:t xml:space="preserve">that would benefit from </w:t>
+      </w:r>
+      <w:proofErr w:type="spellStart"/>
+      <w:r>
+        <w:rPr>
+          <w:sz w:val="20"/>
+          <w:szCs w:val="20"/>
+        </w:rPr>
+        <w:t>Longformer</w:t>
+      </w:r>
+      <w:proofErr w:type="spellEnd"/>
+      <w:r>
+        <w:rPr>
+          <w:sz w:val="20"/>
+          <w:szCs w:val="20"/>
+        </w:rPr>
+        <w:t xml:space="preserve"> capabilities </w:t>
+      </w:r>
+      <w:r>
+        <w:rPr>
+          <w:sz w:val="20"/>
+          <w:szCs w:val="20"/>
+        </w:rPr>
+        <w:t xml:space="preserve">(e.g., larger </w:t>
+      </w:r>
+      <w:proofErr w:type="spellStart"/>
+      <w:r>
+        <w:rPr>
+          <w:sz w:val="20"/>
+          <w:szCs w:val="20"/>
+        </w:rPr>
+        <w:t>max_length</w:t>
+      </w:r>
+      <w:proofErr w:type="spellEnd"/>
+      <w:r>
+        <w:rPr>
+          <w:sz w:val="20"/>
+          <w:szCs w:val="20"/>
+        </w:rPr>
+        <w:t xml:space="preserve">, </w:t>
+      </w:r>
+      <w:r>
+        <w:rPr>
+          <w:sz w:val="20"/>
+          <w:szCs w:val="20"/>
+        </w:rPr>
+        <w:t>batch sizes</w:t>
+      </w:r>
+      <w:r>
+        <w:rPr>
+          <w:sz w:val="20"/>
+          <w:szCs w:val="20"/>
+        </w:rPr>
+        <w:t xml:space="preserve">, </w:t>
+      </w:r>
+      <w:r>
+        <w:rPr>
+          <w:sz w:val="20"/>
+          <w:szCs w:val="20"/>
+        </w:rPr>
+        <w:t>or more complex training loops). Th</w:t>
+      </w:r>
+      <w:r>
+        <w:rPr>
+          <w:sz w:val="20"/>
+          <w:szCs w:val="20"/>
+        </w:rPr>
+        <w:t>is has constrained</w:t>
+      </w:r>
+      <w:r>
+        <w:rPr>
+          <w:sz w:val="20"/>
+          <w:szCs w:val="20"/>
+        </w:rPr>
+        <w:t xml:space="preserve"> </w:t>
+      </w:r>
+      <w:r>
+        <w:rPr>
+          <w:sz w:val="20"/>
+          <w:szCs w:val="20"/>
+        </w:rPr>
+        <w:t xml:space="preserve">our ability to perform an extensive hyperparameter search (e.g., systematic exploration of learning rates, batch sizes, </w:t>
+      </w:r>
+      <w:r>
+        <w:rPr>
+          <w:sz w:val="20"/>
+          <w:szCs w:val="20"/>
+        </w:rPr>
+        <w:t>regularization</w:t>
+      </w:r>
+      <w:r>
+        <w:rPr>
+          <w:sz w:val="20"/>
+          <w:szCs w:val="20"/>
+        </w:rPr>
+        <w:t>), to run multiple random seeds for robustness, or to compare a wider range of architectures and training regimes.</w:t>
+      </w:r>
+    </w:p>
+    <w:p>
+      <w:pPr>
+        <w:spacing w:after="80"/>
+        <w:jc w:val="both"/>
+        <w:rPr>
+          <w:sz w:val="20"/>
+          <w:szCs w:val="20"/>
+        </w:rPr>
+      </w:pPr>
+      <w:r>
+        <w:rPr>
+          <w:sz w:val="20"/>
+          <w:szCs w:val="20"/>
+        </w:rPr>
+        <w:t xml:space="preserve">Consequently, </w:t>
+      </w:r>
+      <w:r>
+        <w:rPr>
+          <w:sz w:val="20"/>
+          <w:szCs w:val="20"/>
+        </w:rPr>
+        <w:t xml:space="preserve">we opted for </w:t>
+      </w:r>
+      <w:hyperlink r:id="rId10" w:history="1">
+        <w:r>
+          <w:rPr>
+            <w:rStyle w:val="Hyperlink"/>
+            <w:sz w:val="20"/>
+            <w:szCs w:val="20"/>
+          </w:rPr>
+          <w:t>SciBERT</w:t>
+        </w:r>
+      </w:hyperlink>
+      <w:r>
+        <w:rPr>
+          <w:sz w:val="20"/>
+          <w:szCs w:val="20"/>
+        </w:rPr>
+        <w:t xml:space="preserve"> instead of </w:t>
+      </w:r>
+      <w:proofErr w:type="spellStart"/>
+      <w:r>
+        <w:rPr>
+          <w:sz w:val="20"/>
+          <w:szCs w:val="20"/>
+        </w:rPr>
+        <w:t>Longformer</w:t>
+      </w:r>
+      <w:proofErr w:type="spellEnd"/>
+      <w:r>
+        <w:rPr>
+          <w:sz w:val="20"/>
+          <w:szCs w:val="20"/>
+        </w:rPr>
+        <w:t xml:space="preserve">, because </w:t>
+      </w:r>
+      <w:r>
+        <w:rPr>
+          <w:sz w:val="20"/>
+          <w:szCs w:val="20"/>
+        </w:rPr>
+        <w:t xml:space="preserve">of </w:t>
+      </w:r>
+      <w:r>
+        <w:rPr>
+          <w:sz w:val="20"/>
+          <w:szCs w:val="20"/>
+        </w:rPr>
+        <w:t xml:space="preserve">being based on a BERT model, </w:t>
+      </w:r>
+      <w:r>
+        <w:rPr>
+          <w:sz w:val="20"/>
+          <w:szCs w:val="20"/>
+        </w:rPr>
+        <w:t xml:space="preserve">its lower supported </w:t>
+      </w:r>
+      <w:proofErr w:type="spellStart"/>
+      <w:r>
+        <w:rPr>
+          <w:sz w:val="20"/>
+          <w:szCs w:val="20"/>
+        </w:rPr>
+        <w:t>max_length</w:t>
+      </w:r>
+      <w:proofErr w:type="spellEnd"/>
+      <w:r>
+        <w:rPr>
+          <w:sz w:val="20"/>
+          <w:szCs w:val="20"/>
+        </w:rPr>
+        <w:t xml:space="preserve"> (512)</w:t>
+      </w:r>
+      <w:r>
+        <w:rPr>
+          <w:sz w:val="20"/>
+          <w:szCs w:val="20"/>
+        </w:rPr>
+        <w:t xml:space="preserve">, </w:t>
+      </w:r>
+      <w:r>
+        <w:rPr>
+          <w:sz w:val="20"/>
+          <w:szCs w:val="20"/>
+        </w:rPr>
+        <w:t xml:space="preserve">enabled </w:t>
+      </w:r>
+      <w:r>
+        <w:rPr>
+          <w:sz w:val="20"/>
+          <w:szCs w:val="20"/>
+        </w:rPr>
+        <w:t>us a stable training environment.</w:t>
+      </w:r>
+    </w:p>
+    <w:p>
+      <w:pPr>
         <w:pStyle w:val="Heading2"/>
         <w:rPr>
           <w:rFonts w:asciiTheme="minorHAnsi" w:hAnsiTheme="minorHAnsi"/>
         </w:rPr>
       </w:pPr>
-      <w:bookmarkStart w:id="2" w:name="_Toc214276333"/>
+      <w:bookmarkStart w:id="3" w:name="_Toc214300270"/>
       <w:r>
         <w:rPr>
           <w:rFonts w:asciiTheme="minorHAnsi" w:hAnsiTheme="minorHAnsi"/>
         </w:rPr>
         <w:t>2. Data Understanding and Preparation</w:t>
       </w:r>
-      <w:bookmarkEnd w:id="2"/>
+      <w:bookmarkEnd w:id="3"/>
     </w:p>
     <w:p>
       <w:pPr>
@@ -1736,6 +2282,7 @@
           <w:b/>
           <w:bCs/>
         </w:rPr>
+        <w:lastRenderedPageBreak/>
         <w:t>Scientific markup and noise.</w:t>
       </w:r>
       <w:r>
@@ -2045,14 +2592,14 @@
           <w:rFonts w:asciiTheme="minorHAnsi" w:hAnsiTheme="minorHAnsi"/>
         </w:rPr>
       </w:pPr>
-      <w:bookmarkStart w:id="3" w:name="_Toc214276334"/>
+      <w:bookmarkStart w:id="4" w:name="_Toc214300271"/>
       <w:r>
         <w:rPr>
           <w:rFonts w:asciiTheme="minorHAnsi" w:hAnsiTheme="minorHAnsi"/>
         </w:rPr>
         <w:t>3. Modeling Choices and Architecture</w:t>
       </w:r>
-      <w:bookmarkEnd w:id="3"/>
+      <w:bookmarkEnd w:id="4"/>
     </w:p>
     <w:p>
       <w:pPr>
@@ -2061,7 +2608,7 @@
       <w:r>
         <w:t xml:space="preserve">The core model is based on </w:t>
       </w:r>
-      <w:hyperlink r:id="rId10" w:history="1">
+      <w:hyperlink r:id="rId11" w:history="1">
         <w:r>
           <w:rPr>
             <w:rStyle w:val="Hyperlink"/>
@@ -2111,7 +2658,11 @@
         <w:t>”</w:t>
       </w:r>
       <w:r>
-        <w:t>), a domain-adapted BERT variant pretrained on a large corpus of scientific articles. This choice is aligned with the task: S</w:t>
+        <w:t xml:space="preserve">), a domain-adapted BERT variant pretrained on a large corpus of scientific articles. This choice is aligned with </w:t>
+      </w:r>
+      <w:r>
+        <w:lastRenderedPageBreak/>
+        <w:t>the task: S</w:t>
       </w:r>
       <w:r>
         <w:t>ci</w:t>
@@ -2384,24 +2935,24 @@
           <w:rFonts w:asciiTheme="minorHAnsi" w:hAnsiTheme="minorHAnsi"/>
         </w:rPr>
       </w:pPr>
-      <w:bookmarkStart w:id="4" w:name="_Toc214276335"/>
+      <w:bookmarkStart w:id="5" w:name="_Toc214300272"/>
       <w:r>
         <w:rPr>
           <w:rFonts w:asciiTheme="minorHAnsi" w:hAnsiTheme="minorHAnsi"/>
         </w:rPr>
         <w:t>4. Quantitative Results</w:t>
       </w:r>
-      <w:bookmarkEnd w:id="4"/>
+      <w:bookmarkEnd w:id="5"/>
     </w:p>
     <w:p>
       <w:pPr>
         <w:pStyle w:val="Heading3"/>
       </w:pPr>
-      <w:bookmarkStart w:id="5" w:name="_Toc214276336"/>
+      <w:bookmarkStart w:id="6" w:name="_Toc214300273"/>
       <w:r>
         <w:t>4.1 Overall and Baseline Comparison</w:t>
       </w:r>
-      <w:bookmarkEnd w:id="5"/>
+      <w:bookmarkEnd w:id="6"/>
     </w:p>
     <w:p>
       <w:pPr>
@@ -2421,6 +2972,7 @@
         <w:jc w:val="both"/>
       </w:pPr>
       <w:r>
+        <w:lastRenderedPageBreak/>
         <w:t>O</w:t>
       </w:r>
       <w:r>
@@ -2531,11 +3083,11 @@
       <w:pPr>
         <w:pStyle w:val="Heading3"/>
       </w:pPr>
-      <w:bookmarkStart w:id="6" w:name="_Toc214276337"/>
+      <w:bookmarkStart w:id="7" w:name="_Toc214300274"/>
       <w:r>
         <w:t>4.2 Hierarchical Performance: Domains vs Fine Subjects</w:t>
       </w:r>
-      <w:bookmarkEnd w:id="6"/>
+      <w:bookmarkEnd w:id="7"/>
     </w:p>
     <w:p>
       <w:pPr>
@@ -2769,7 +3321,7 @@
       <w:pPr>
         <w:pStyle w:val="Heading3"/>
       </w:pPr>
-      <w:bookmarkStart w:id="7" w:name="_Toc214276338"/>
+      <w:bookmarkStart w:id="8" w:name="_Toc214300275"/>
       <w:r>
         <w:t>4.3 Per-</w:t>
       </w:r>
@@ -2779,7 +3331,7 @@
       <w:r>
         <w:t>ategory Behavior and Production Readiness</w:t>
       </w:r>
-      <w:bookmarkEnd w:id="7"/>
+      <w:bookmarkEnd w:id="8"/>
     </w:p>
     <w:p>
       <w:pPr>
@@ -2799,6 +3351,7 @@
         <w:jc w:val="both"/>
       </w:pPr>
       <w:r>
+        <w:lastRenderedPageBreak/>
         <w:t>The best subjects, such as </w:t>
       </w:r>
       <w:r>
@@ -2990,11 +3543,11 @@
       <w:pPr>
         <w:pStyle w:val="Heading3"/>
       </w:pPr>
-      <w:bookmarkStart w:id="8" w:name="_Toc214276339"/>
+      <w:bookmarkStart w:id="9" w:name="_Toc214300276"/>
       <w:r>
         <w:t>4.4 Confidence Calibration</w:t>
       </w:r>
-      <w:bookmarkEnd w:id="8"/>
+      <w:bookmarkEnd w:id="9"/>
     </w:p>
     <w:p>
       <w:pPr>
@@ -3193,6 +3746,7 @@
         <w:jc w:val="both"/>
       </w:pPr>
       <w:r>
+        <w:lastRenderedPageBreak/>
         <w:t>This kind of confidence-aware workflow is precisely what the initial business framing envisioned.</w:t>
       </w:r>
     </w:p>
@@ -3203,14 +3757,14 @@
           <w:rFonts w:asciiTheme="minorHAnsi" w:hAnsiTheme="minorHAnsi"/>
         </w:rPr>
       </w:pPr>
-      <w:bookmarkStart w:id="9" w:name="_Toc214276340"/>
+      <w:bookmarkStart w:id="10" w:name="_Toc214300277"/>
       <w:r>
         <w:rPr>
           <w:rFonts w:asciiTheme="minorHAnsi" w:hAnsiTheme="minorHAnsi"/>
         </w:rPr>
         <w:t>5. Impact of Design Choices</w:t>
       </w:r>
-      <w:bookmarkEnd w:id="9"/>
+      <w:bookmarkEnd w:id="10"/>
     </w:p>
     <w:p>
       <w:pPr>
@@ -3429,14 +3983,14 @@
           <w:rFonts w:asciiTheme="minorHAnsi" w:hAnsiTheme="minorHAnsi"/>
         </w:rPr>
       </w:pPr>
-      <w:bookmarkStart w:id="10" w:name="_Toc214276341"/>
+      <w:bookmarkStart w:id="11" w:name="_Toc214300278"/>
       <w:r>
         <w:rPr>
           <w:rFonts w:asciiTheme="minorHAnsi" w:hAnsiTheme="minorHAnsi"/>
         </w:rPr>
         <w:t>6. Limitations</w:t>
       </w:r>
-      <w:bookmarkEnd w:id="10"/>
+      <w:bookmarkEnd w:id="11"/>
     </w:p>
     <w:p>
       <w:pPr>
@@ -3465,7 +4019,7 @@
       <w:r>
         <w:t> The current model predicts only the primary subject, ignoring the multi-label nature of many papers. This is a deliberate simplification for the case study, but it means that the system cannot yet express that a paper simultaneously belongs to, for example, “cs.LG” and “</w:t>
       </w:r>
-      <w:hyperlink r:id="rId11" w:history="1">
+      <w:hyperlink r:id="rId12" w:history="1">
         <w:r>
           <w:rPr>
             <w:rStyle w:val="Hyperlink"/>
@@ -3494,7 +4048,11 @@
         <w:t>Restricted training set.</w:t>
       </w:r>
       <w:r>
-        <w:t> To keep training feasible, the model is trained on a balanced subset with at most 1,000 examples per category. This sacrifices the tail of ultra-rare classes and discards a large portion of the available data for the frequent ones. While this design improves per-class stability, it also sets an upper bound on what the model can learn about rare or subtle distinctions.</w:t>
+        <w:t xml:space="preserve"> To keep training feasible, the model is trained on a balanced subset with at most 1,000 examples per category. This sacrifices the tail of ultra-rare </w:t>
+      </w:r>
+      <w:r>
+        <w:lastRenderedPageBreak/>
+        <w:t>classes and discards a large portion of the available data for the frequent ones. While this design improves per-class stability, it also sets an upper bound on what the model can learn about rare or subtle distinctions.</w:t>
       </w:r>
     </w:p>
     <w:p>
@@ -3602,7 +4160,7 @@
           <w:rFonts w:asciiTheme="minorHAnsi" w:hAnsiTheme="minorHAnsi"/>
         </w:rPr>
       </w:pPr>
-      <w:bookmarkStart w:id="11" w:name="_Toc214276342"/>
+      <w:bookmarkStart w:id="12" w:name="_Toc214300279"/>
       <w:r>
         <w:rPr>
           <w:rFonts w:asciiTheme="minorHAnsi" w:hAnsiTheme="minorHAnsi"/>
@@ -3615,7 +4173,7 @@
         </w:rPr>
         <w:t>. Final Remarks</w:t>
       </w:r>
-      <w:bookmarkEnd w:id="11"/>
+      <w:bookmarkEnd w:id="12"/>
     </w:p>
     <w:p>
       <w:pPr>
@@ -3796,7 +4354,11 @@
         <w:jc w:val="both"/>
       </w:pPr>
       <w:r>
-        <w:t>In that sense, the project achieves its primary goal: to show, with quantitative evidence and a transparent methodology, how a modern language model can be applied to a real-world scientific classification task and how its performance can be rigorously evaluated and interpreted.</w:t>
+        <w:t xml:space="preserve">In that sense, the project achieves its primary goal: to show, with quantitative evidence and a transparent methodology, how a modern language model can be applied to a real-world </w:t>
+      </w:r>
+      <w:r>
+        <w:lastRenderedPageBreak/>
+        <w:t>scientific classification task and how its performance can be rigorously evaluated and interpreted.</w:t>
       </w:r>
     </w:p>
     <w:p>
@@ -3806,7 +4368,7 @@
     </w:p>
     <w:bookmarkEnd w:id="0"/>
     <w:sectPr>
-      <w:footerReference w:type="default" r:id="rId12"/>
+      <w:footerReference w:type="default" r:id="rId13"/>
       <w:pgSz w:w="11906" w:h="16838" w:code="9"/>
       <w:pgMar w:top="1152" w:right="1152" w:bottom="1152" w:left="1440" w:header="706" w:footer="706" w:gutter="0"/>
       <w:pgNumType w:start="0"/>

</xml_diff>

<commit_message>
Spare one extra page by making one line shorter
</commit_message>
<xml_diff>
--- a/report/genai_p3_report_summary.docx
+++ b/report/genai_p3_report_summary.docx
@@ -4238,7 +4238,15 @@
         <w:t>A</w:t>
       </w:r>
       <w:r>
-        <w:t xml:space="preserve"> clearly motivated objective (automated subject classification for arXiv-like repositories)</w:t>
+        <w:t xml:space="preserve"> </w:t>
+      </w:r>
+      <w:proofErr w:type="spellStart"/>
+      <w:r>
+        <w:t>clearl</w:t>
+      </w:r>
+      <w:proofErr w:type="spellEnd"/>
+      <w:r>
+        <w:t xml:space="preserve"> objective (automated subject classification for arXiv-like repositories)</w:t>
       </w:r>
       <w:r>
         <w:t>.</w:t>
@@ -4354,17 +4362,8 @@
         <w:jc w:val="both"/>
       </w:pPr>
       <w:r>
-        <w:t xml:space="preserve">In that sense, the project achieves its primary goal: to show, with quantitative evidence and a transparent methodology, how a modern language model can be applied to a real-world </w:t>
-      </w:r>
-      <w:r>
-        <w:lastRenderedPageBreak/>
-        <w:t>scientific classification task and how its performance can be rigorously evaluated and interpreted.</w:t>
-      </w:r>
-    </w:p>
-    <w:p>
-      <w:pPr>
-        <w:jc w:val="both"/>
-      </w:pPr>
+        <w:t>In that sense, the project achieves its primary goal: to show, with quantitative evidence and a transparent methodology, how a modern language model can be applied to a real-world scientific classification task and how its performance can be rigorously evaluated and interpreted.</w:t>
+      </w:r>
     </w:p>
     <w:bookmarkEnd w:id="0"/>
     <w:sectPr>

</xml_diff>

<commit_message>
Minor adjustment in the Note
</commit_message>
<xml_diff>
--- a/report/genai_p3_report_summary.docx
+++ b/report/genai_p3_report_summary.docx
@@ -1931,7 +1931,7 @@
           <w:sz w:val="20"/>
           <w:szCs w:val="20"/>
         </w:rPr>
-        <w:t xml:space="preserve"> of </w:t>
+        <w:t>=</w:t>
       </w:r>
       <w:r>
         <w:rPr>
@@ -2123,7 +2123,37 @@
           <w:sz w:val="20"/>
           <w:szCs w:val="20"/>
         </w:rPr>
-        <w:t xml:space="preserve">we opted for </w:t>
+        <w:t xml:space="preserve">instead of </w:t>
+      </w:r>
+      <w:proofErr w:type="spellStart"/>
+      <w:r>
+        <w:rPr>
+          <w:sz w:val="20"/>
+          <w:szCs w:val="20"/>
+        </w:rPr>
+        <w:t>Longformer</w:t>
+      </w:r>
+      <w:proofErr w:type="spellEnd"/>
+      <w:r>
+        <w:rPr>
+          <w:sz w:val="20"/>
+          <w:szCs w:val="20"/>
+        </w:rPr>
+        <w:t xml:space="preserve">, </w:t>
+      </w:r>
+      <w:r>
+        <w:rPr>
+          <w:sz w:val="20"/>
+          <w:szCs w:val="20"/>
+        </w:rPr>
+        <w:t xml:space="preserve">we opted </w:t>
+      </w:r>
+      <w:r>
+        <w:rPr>
+          <w:sz w:val="20"/>
+          <w:szCs w:val="20"/>
+        </w:rPr>
+        <w:t xml:space="preserve">for </w:t>
       </w:r>
       <w:hyperlink r:id="rId10" w:history="1">
         <w:r>
@@ -2140,74 +2170,114 @@
           <w:sz w:val="20"/>
           <w:szCs w:val="20"/>
         </w:rPr>
-        <w:t xml:space="preserve"> instead of </w:t>
-      </w:r>
-      <w:proofErr w:type="spellStart"/>
+        <w:t xml:space="preserve">, </w:t>
+      </w:r>
       <w:r>
         <w:rPr>
           <w:sz w:val="20"/>
           <w:szCs w:val="20"/>
         </w:rPr>
-        <w:t>Longformer</w:t>
-      </w:r>
-      <w:proofErr w:type="spellEnd"/>
+        <w:t xml:space="preserve">a </w:t>
+      </w:r>
       <w:r>
         <w:rPr>
           <w:sz w:val="20"/>
           <w:szCs w:val="20"/>
         </w:rPr>
-        <w:t xml:space="preserve">, because </w:t>
+        <w:t xml:space="preserve">variant of </w:t>
       </w:r>
       <w:r>
         <w:rPr>
           <w:sz w:val="20"/>
           <w:szCs w:val="20"/>
         </w:rPr>
-        <w:t xml:space="preserve">of </w:t>
+        <w:t xml:space="preserve">BERT </w:t>
       </w:r>
       <w:r>
         <w:rPr>
           <w:sz w:val="20"/>
           <w:szCs w:val="20"/>
         </w:rPr>
-        <w:t xml:space="preserve">being based on a BERT model, </w:t>
-      </w:r>
+        <w:t>(</w:t>
+      </w:r>
+      <w:proofErr w:type="spellStart"/>
       <w:r>
         <w:rPr>
           <w:sz w:val="20"/>
           <w:szCs w:val="20"/>
         </w:rPr>
-        <w:t xml:space="preserve">its lower supported </w:t>
-      </w:r>
-      <w:proofErr w:type="spellStart"/>
+        <w:t>max_length</w:t>
+      </w:r>
+      <w:proofErr w:type="spellEnd"/>
       <w:r>
         <w:rPr>
           <w:sz w:val="20"/>
           <w:szCs w:val="20"/>
         </w:rPr>
-        <w:t>max_length</w:t>
-      </w:r>
-      <w:proofErr w:type="spellEnd"/>
+        <w:t>=512)</w:t>
+      </w:r>
       <w:r>
         <w:rPr>
           <w:sz w:val="20"/>
           <w:szCs w:val="20"/>
         </w:rPr>
-        <w:t xml:space="preserve"> (512), </w:t>
+        <w:t xml:space="preserve"> specifically designed for scientific text</w:t>
       </w:r>
       <w:r>
         <w:rPr>
           <w:sz w:val="20"/>
           <w:szCs w:val="20"/>
         </w:rPr>
-        <w:t xml:space="preserve">enabled </w:t>
+        <w:t>.</w:t>
       </w:r>
       <w:r>
         <w:rPr>
           <w:sz w:val="20"/>
           <w:szCs w:val="20"/>
         </w:rPr>
-        <w:t>us a stable training environment.</w:t>
+        <w:t xml:space="preserve"> </w:t>
+      </w:r>
+      <w:r>
+        <w:rPr>
+          <w:sz w:val="20"/>
+          <w:szCs w:val="20"/>
+        </w:rPr>
+        <w:t xml:space="preserve">This model change </w:t>
+      </w:r>
+      <w:r>
+        <w:rPr>
+          <w:sz w:val="20"/>
+          <w:szCs w:val="20"/>
+        </w:rPr>
+        <w:t>enabled</w:t>
+      </w:r>
+      <w:r>
+        <w:rPr>
+          <w:sz w:val="20"/>
+          <w:szCs w:val="20"/>
+        </w:rPr>
+        <w:t xml:space="preserve"> </w:t>
+      </w:r>
+      <w:r>
+        <w:rPr>
+          <w:sz w:val="20"/>
+          <w:szCs w:val="20"/>
+        </w:rPr>
+        <w:t xml:space="preserve">a </w:t>
+      </w:r>
+      <w:r>
+        <w:rPr>
+          <w:sz w:val="20"/>
+          <w:szCs w:val="20"/>
+        </w:rPr>
+        <w:t xml:space="preserve">more </w:t>
+      </w:r>
+      <w:r>
+        <w:rPr>
+          <w:sz w:val="20"/>
+          <w:szCs w:val="20"/>
+        </w:rPr>
+        <w:t>stable training environment.</w:t>
       </w:r>
     </w:p>
     <w:p>

</xml_diff>